<commit_message>
Automate NEO gender composition from SEC EDGAR DEF 14A proxies
Replace hardcoded composition data with automated extraction:
- Parse Summary Compensation Table from proxy markdown to get NEO names
- 3-tier gender cascade: honorifics (Mr./Ms.) from filing text,
  first-name heuristic, then manual-verification fallback
- Handles multi-line cells, zero-width spaces, split names
- 39/50 companies yield real NEO data; 11 with unusual formats
  return 0 NEOs (parser limitation, noted in data)
- Update merge_and_analyze.py for new schema
- Regenerate all 3 CSVs with real SEC-derived data

Made-with: Cursor
</commit_message>
<xml_diff>
--- a/Research_Proposal_Women_Leadership.docx
+++ b/Research_Proposal_Women_Leadership.docx
@@ -59,12 +59,12 @@
     </w:p>
     <w:p>
       <w:r>
-        <w:t>Despite decades of organizational effort, women remain underrepresented in senior leadership. Women account for nearly half the workforce, yet only 8% of S&amp;P 500 companies have a female CEO and roughly 33% of board seats are held by women (Catalyst, 2024). Prior research has identified individual-level barriers such as stereotype threat and work-family conflict (Eagly &amp; Carli, 2007), but less attention has been paid to firm-level structural factors that may enable or constrain women's advancement. Understanding which organizational characteristics predict higher representation of women in leadership is critical for designing effective interventions.</w:t>
+        <w:t>Despite decades of organizational effort, women remain underrepresented in senior leadership. Women account for nearly half the workforce, yet only 8% of S&amp;P 500 companies have a female CEO and roughly 33% of board seats are held by women (Catalyst, 2024). Prior research has identified individual-level barriers such as stereotype threat and work-family conflict (Eagly &amp; Carli, 2007), but less attention has been paid to firm-level structural factors that may enable or constrain women's advancement into leadership roles. Understanding which organizational characteristics predict higher representation of women in leadership is critical for designing effective interventions.</w:t>
       </w:r>
     </w:p>
     <w:p>
       <w:r>
-        <w:t>This study examines what firm-level factors predict women's representation in executive leadership positions across S&amp;P 500 companies. Using publicly available data from SEC EDGAR proxy filings and corporate governance reports, the study tests whether board gender diversity, the presence of a female CEO or CFO, industry type, and firm size predict the proportion of women in the C-suite.</w:t>
+        <w:t>This study examines what firm-level factors predict women's representation in top leadership positions (executive and board level) across a defined sample of S&amp;P 500 companies. Using publicly available data from SEC EDGAR proxy filings and corporate governance reports, the study tests whether board gender diversity, the presence of a female CEO or CFO, industry type, and firm size predict the proportion of women in the C-suite. The project is scoped as a pilot with one primary outcome and a manageable sample so that it remains feasible within the course timeline; if automated data collection or expansion does not pan out quickly, alternative designs (e.g., smaller sample or different outcome) will be considered to keep the paper achievable.</w:t>
       </w:r>
     </w:p>
     <w:p>
@@ -80,7 +80,7 @@
     </w:p>
     <w:p>
       <w:r>
-        <w:t>RQ: What firm-level factors predict women's representation in executive leadership (C-suite) positions?</w:t>
+        <w:t>RQ: What firm-level factors predict women's representation in top leadership positions (C-suite) in a sample of S&amp;P 500 firms?</w:t>
       </w:r>
     </w:p>
     <w:p/>
@@ -126,7 +126,7 @@
     </w:p>
     <w:p>
       <w:r>
-        <w:t>Dependent variable: Proportion of women in the C-suite (% women in C-suite).</w:t>
+        <w:t>Dependent variable: Proportion of women in the C-suite (% women in C-suite), operationalized as representation in top leadership positions.</w:t>
       </w:r>
     </w:p>
     <w:p>
@@ -152,17 +152,7 @@
     </w:p>
     <w:p>
       <w:r>
-        <w:rPr>
-          <w:rFonts w:ascii="Times New Roman" w:hAnsi="Times New Roman"/>
-          <w:b/>
-        </w:rPr>
-        <w:t xml:space="preserve">Data and sample. </w:t>
-      </w:r>
-      <w:r>
-        <w:rPr>
-          <w:rFonts w:ascii="Times New Roman" w:hAnsi="Times New Roman"/>
-        </w:rPr>
-        <w:t>The dataset comprises 50 S&amp;P 500 companies sampled across 10 industries (Technology, Finance, Healthcare, Consumer, Industrial, Energy, Media, Telecom, Automotive, Logistics). Data were collected from two sources: (1) SEC EDGAR DEF 14A proxy statements accessed via the edgartools Python library, providing filing dates and verifying board/executive composition; and (2) publicly available corporate governance reports and leadership pages, providing board size, number of women on the board, C-suite size, number of women in the C-suite, and CEO/CFO gender. All data reflect the most recent fiscal year (2024). A pilot dataset of N = 50 has been compiled; the full study will expand to N = 200+ firms.</w:t>
+        <w:t>Data and sample. The study is limited to one primary outcome (C-suite leadership representation) and a defined sample of S&amp;P 500 companies to keep the undertaking manageable. The dataset comprises 50 S&amp;P 500 companies sampled across 10 industries (Technology, Finance, Healthcare, Consumer, Industrial, Energy, Media, Telecom, Automotive, Logistics). Data were collected from two sources: (1) SEC EDGAR DEF 14A proxy statements accessed via the edgartools Python library, providing filing dates and verifying board/executive composition; and (2) publicly available corporate governance reports and leadership pages, providing board size, number of women on the board, C-suite size, number of women in the C-suite, and CEO/CFO gender. All data reflect the most recent fiscal year (2024). A pilot dataset of N = 50 has been compiled; the full study may expand to a larger S&amp;P 500 subset depending on feasibility.</w:t>
       </w:r>
     </w:p>
     <w:p>
@@ -258,7 +248,23 @@
     </w:p>
     <w:p>
       <w:r>
-        <w:t>This study contributes to leadership research in three ways. First, it shifts the focus from individual-level barriers to firm-level enablers of women's advancement, providing actionable insights for organizational design. Second, it uses publicly available, verifiable data from SEC filings rather than self-report surveys, reducing common method bias. Third, by examining industry as a moderator, it acknowledges that the path to leadership for women is not uniform across sectors, aligning with calls to study leadership in context (Martin, Ono, Russo, &amp; Thomas, 2023).</w:t>
+        <w:t>This study contributes to leadership research in three ways. First, it shifts the focus from individual-level barriers to firm-level enablers of women's advancement into leadership roles, providing actionable insights for organizational design and leadership pipeline development. Second, it uses publicly available, verifiable data from SEC filings rather than self-report surveys, reducing common method bias. Third, by examining industry as a moderator, it acknowledges that the path to leadership for women is not uniform across sectors, aligning with calls to study leadership in context (Martin, Ono, Russo, &amp; Thomas, 2023).</w:t>
+      </w:r>
+    </w:p>
+    <w:p>
+      <w:pPr>
+        <w:pStyle w:val="Heading2"/>
+      </w:pPr>
+      <w:r>
+        <w:rPr>
+          <w:rFonts w:ascii="Times New Roman" w:hAnsi="Times New Roman"/>
+        </w:rPr>
+        <w:t>Limitations and future directions</w:t>
+      </w:r>
+    </w:p>
+    <w:p>
+      <w:r>
+        <w:t>This study focuses on leadership composition (C-suite and board) to maintain a clear leadership focus and a manageable scope. Other areas where gender and board composition could matter—such as public trust in the company, public perceptions of the organization as an ethical actor, or gender composition of industry—are left for future work; including them would require additional data (e.g., surveys or reputation indices) and is beyond the scope of this paper.</w:t>
       </w:r>
     </w:p>
     <w:p>

</xml_diff>